<commit_message>
Finished PEX code and report
</commit_message>
<xml_diff>
--- a/PEX3_Report_Template.docx
+++ b/PEX3_Report_Template.docx
@@ -24,7 +24,22 @@
       </w:r>
       <w:r>
         <w:br/>
-        <w:t>Name: ________________________     Section: ________     Date: ____________</w:t>
+        <w:t xml:space="preserve">Name: </w:t>
+      </w:r>
+      <w:r>
+        <w:t>Aidan Blankenship</w:t>
+      </w:r>
+      <w:r>
+        <w:t xml:space="preserve">     Section: </w:t>
+      </w:r>
+      <w:r>
+        <w:t>M4</w:t>
+      </w:r>
+      <w:r>
+        <w:t xml:space="preserve">     Date: </w:t>
+      </w:r>
+      <w:r>
+        <w:t>4/23/2026</w:t>
       </w:r>
     </w:p>
     <w:p>
@@ -37,7 +52,7 @@
     </w:p>
     <w:p>
       <w:r>
-        <w:t>[Replace this text with your documentation statement per the course syllabus. List all help received, references consulted, and AI tools used. A documentation statement is also required in main.c. Missing documentation from either location results in a 5% (4 pt) deduction.]</w:t>
+        <w:t>None.</w:t>
       </w:r>
     </w:p>
     <w:p>
@@ -50,7 +65,42 @@
     </w:p>
     <w:p>
       <w:r>
-        <w:t>[State which frame size and how many frames you recommend to keep the page-fault rate below 10%. Justify your recommendation using your simulation data. Consider both memory overhead and fault-rate performance.]</w:t>
+        <w:t>A frame size of 1kb is recommended because it only needs</w:t>
+      </w:r>
+      <w:r>
+        <w:t xml:space="preserve"> 32.2% of its maximum frames </w:t>
+      </w:r>
+      <w:proofErr w:type="gramStart"/>
+      <w:r>
+        <w:t>in order to</w:t>
+      </w:r>
+      <w:proofErr w:type="gramEnd"/>
+      <w:r>
+        <w:t xml:space="preserve"> have a fault rate below 10%. This is the lowest out of </w:t>
+      </w:r>
+      <w:proofErr w:type="gramStart"/>
+      <w:r>
+        <w:t>all of</w:t>
+      </w:r>
+      <w:proofErr w:type="gramEnd"/>
+      <w:r>
+        <w:t xml:space="preserve"> the frame sizes tested, making it the best </w:t>
+      </w:r>
+      <w:proofErr w:type="gramStart"/>
+      <w:r>
+        <w:t>in order to</w:t>
+      </w:r>
+      <w:proofErr w:type="gramEnd"/>
+      <w:r>
+        <w:t xml:space="preserve"> have a low fault rate while </w:t>
+      </w:r>
+      <w:proofErr w:type="gramStart"/>
+      <w:r>
+        <w:t>still keeping</w:t>
+      </w:r>
+      <w:proofErr w:type="gramEnd"/>
+      <w:r>
+        <w:t xml:space="preserve"> memory overhead low. The recommended number of frames is 1319 because that is when the fault rate falls below 10%, and this also has the lowest memory overhead allowing better performance.</w:t>
       </w:r>
     </w:p>
     <w:p>
@@ -59,11 +109,6 @@
       </w:pPr>
       <w:r>
         <w:t>2. Frames Required to Achieve &lt; 10% Page-Fault Rate (4 pts)</w:t>
-      </w:r>
-    </w:p>
-    <w:p>
-      <w:r>
-        <w:t>For each frame size, identify the minimum number of frames where the page-fault rate first drops below 10%.</w:t>
       </w:r>
     </w:p>
     <w:tbl>
@@ -145,6 +190,9 @@
             <w:pPr>
               <w:cnfStyle w:val="000000100000" w:firstRow="0" w:lastRow="0" w:firstColumn="0" w:lastColumn="0" w:oddVBand="0" w:evenVBand="0" w:oddHBand="1" w:evenHBand="0" w:firstRowFirstColumn="0" w:firstRowLastColumn="0" w:lastRowFirstColumn="0" w:lastRowLastColumn="0"/>
             </w:pPr>
+            <w:r>
+              <w:t>2974</w:t>
+            </w:r>
           </w:p>
         </w:tc>
         <w:tc>
@@ -155,6 +203,9 @@
             <w:pPr>
               <w:cnfStyle w:val="000000100000" w:firstRow="0" w:lastRow="0" w:firstColumn="0" w:lastColumn="0" w:oddVBand="0" w:evenVBand="0" w:oddHBand="1" w:evenHBand="0" w:firstRowFirstColumn="0" w:firstRowLastColumn="0" w:lastRowFirstColumn="0" w:lastRowLastColumn="0"/>
             </w:pPr>
+            <w:r>
+              <w:t>0.099990</w:t>
+            </w:r>
           </w:p>
         </w:tc>
       </w:tr>
@@ -182,6 +233,9 @@
             <w:pPr>
               <w:cnfStyle w:val="000000010000" w:firstRow="0" w:lastRow="0" w:firstColumn="0" w:lastColumn="0" w:oddVBand="0" w:evenVBand="0" w:oddHBand="0" w:evenHBand="1" w:firstRowFirstColumn="0" w:firstRowLastColumn="0" w:lastRowFirstColumn="0" w:lastRowLastColumn="0"/>
             </w:pPr>
+            <w:r>
+              <w:t>1319</w:t>
+            </w:r>
           </w:p>
         </w:tc>
         <w:tc>
@@ -192,6 +246,9 @@
             <w:pPr>
               <w:cnfStyle w:val="000000010000" w:firstRow="0" w:lastRow="0" w:firstColumn="0" w:lastColumn="0" w:oddVBand="0" w:evenVBand="0" w:oddHBand="0" w:evenHBand="1" w:firstRowFirstColumn="0" w:firstRowLastColumn="0" w:lastRowFirstColumn="0" w:lastRowLastColumn="0"/>
             </w:pPr>
+            <w:r>
+              <w:t>0.099995</w:t>
+            </w:r>
           </w:p>
         </w:tc>
       </w:tr>
@@ -219,6 +276,9 @@
             <w:pPr>
               <w:cnfStyle w:val="000000100000" w:firstRow="0" w:lastRow="0" w:firstColumn="0" w:lastColumn="0" w:oddVBand="0" w:evenVBand="0" w:oddHBand="1" w:evenHBand="0" w:firstRowFirstColumn="0" w:firstRowLastColumn="0" w:lastRowFirstColumn="0" w:lastRowLastColumn="0"/>
             </w:pPr>
+            <w:r>
+              <w:t>685</w:t>
+            </w:r>
           </w:p>
         </w:tc>
         <w:tc>
@@ -229,6 +289,9 @@
             <w:pPr>
               <w:cnfStyle w:val="000000100000" w:firstRow="0" w:lastRow="0" w:firstColumn="0" w:lastColumn="0" w:oddVBand="0" w:evenVBand="0" w:oddHBand="1" w:evenHBand="0" w:firstRowFirstColumn="0" w:firstRowLastColumn="0" w:lastRowFirstColumn="0" w:lastRowLastColumn="0"/>
             </w:pPr>
+            <w:r>
+              <w:t>0.099946</w:t>
+            </w:r>
           </w:p>
         </w:tc>
       </w:tr>
@@ -256,6 +319,9 @@
             <w:pPr>
               <w:cnfStyle w:val="000000010000" w:firstRow="0" w:lastRow="0" w:firstColumn="0" w:lastColumn="0" w:oddVBand="0" w:evenVBand="0" w:oddHBand="0" w:evenHBand="1" w:firstRowFirstColumn="0" w:firstRowLastColumn="0" w:lastRowFirstColumn="0" w:lastRowLastColumn="0"/>
             </w:pPr>
+            <w:r>
+              <w:t>380</w:t>
+            </w:r>
           </w:p>
         </w:tc>
         <w:tc>
@@ -266,6 +332,9 @@
             <w:pPr>
               <w:cnfStyle w:val="000000010000" w:firstRow="0" w:lastRow="0" w:firstColumn="0" w:lastColumn="0" w:oddVBand="0" w:evenVBand="0" w:oddHBand="0" w:evenHBand="1" w:firstRowFirstColumn="0" w:firstRowLastColumn="0" w:lastRowFirstColumn="0" w:lastRowLastColumn="0"/>
             </w:pPr>
+            <w:r>
+              <w:t>0.099904</w:t>
+            </w:r>
           </w:p>
         </w:tc>
       </w:tr>
@@ -276,12 +345,8 @@
         <w:pStyle w:val="Heading1"/>
       </w:pPr>
       <w:r>
+        <w:lastRenderedPageBreak/>
         <w:t>3. Frames vs. Number of Page Faults — 4 charts (6 pts)</w:t>
-      </w:r>
-    </w:p>
-    <w:p>
-      <w:r>
-        <w:t>Insert one chart per frame size showing Frames (x-axis) vs. Number of Page Faults (y-axis). Each chart must have a descriptive title, labeled axes with units, and clean formatting. (1.5 pts per chart)</w:t>
       </w:r>
     </w:p>
     <w:p>
@@ -293,61 +358,143 @@
       </w:r>
     </w:p>
     <w:p>
+      <w:r>
+        <w:drawing>
+          <wp:inline distT="0" distB="0" distL="0" distR="0" wp14:anchorId="5F0914CF" wp14:editId="3BCE4F44">
+            <wp:extent cx="5486400" cy="3308350"/>
+            <wp:effectExtent l="0" t="0" r="0" b="6350"/>
+            <wp:docPr id="1491412833" name="Picture 1"/>
+            <wp:cNvGraphicFramePr>
+              <a:graphicFrameLocks xmlns:a="http://schemas.openxmlformats.org/drawingml/2006/main" noChangeAspect="1"/>
+            </wp:cNvGraphicFramePr>
+            <a:graphic xmlns:a="http://schemas.openxmlformats.org/drawingml/2006/main">
+              <a:graphicData uri="http://schemas.openxmlformats.org/drawingml/2006/picture">
+                <pic:pic xmlns:pic="http://schemas.openxmlformats.org/drawingml/2006/picture">
+                  <pic:nvPicPr>
+                    <pic:cNvPr id="1491412833" name=""/>
+                    <pic:cNvPicPr/>
+                  </pic:nvPicPr>
+                  <pic:blipFill>
+                    <a:blip r:embed="rId9"/>
+                    <a:stretch>
+                      <a:fillRect/>
+                    </a:stretch>
+                  </pic:blipFill>
+                  <pic:spPr>
+                    <a:xfrm>
+                      <a:off x="0" y="0"/>
+                      <a:ext cx="5486400" cy="3308350"/>
+                    </a:xfrm>
+                    <a:prstGeom prst="rect">
+                      <a:avLst/>
+                    </a:prstGeom>
+                  </pic:spPr>
+                </pic:pic>
+              </a:graphicData>
+            </a:graphic>
+          </wp:inline>
+        </w:drawing>
+      </w:r>
+    </w:p>
+    <w:p>
       <w:pPr>
-        <w:jc w:val="center"/>
+        <w:pStyle w:val="Heading3"/>
       </w:pPr>
       <w:r>
-        <w:rPr>
-          <w:i/>
-          <w:color w:val="888888"/>
-        </w:rPr>
-        <w:t>[Insert 512 B Page Faults chart here]</w:t>
+        <w:t>1 KB Frames — Page Faults (1.5 pts)</w:t>
       </w:r>
     </w:p>
-    <w:p/>
+    <w:p>
+      <w:r>
+        <w:drawing>
+          <wp:inline distT="0" distB="0" distL="0" distR="0" wp14:anchorId="2585E64C" wp14:editId="7B152EFA">
+            <wp:extent cx="5486400" cy="3216275"/>
+            <wp:effectExtent l="0" t="0" r="0" b="3175"/>
+            <wp:docPr id="955307068" name="Picture 1"/>
+            <wp:cNvGraphicFramePr>
+              <a:graphicFrameLocks xmlns:a="http://schemas.openxmlformats.org/drawingml/2006/main" noChangeAspect="1"/>
+            </wp:cNvGraphicFramePr>
+            <a:graphic xmlns:a="http://schemas.openxmlformats.org/drawingml/2006/main">
+              <a:graphicData uri="http://schemas.openxmlformats.org/drawingml/2006/picture">
+                <pic:pic xmlns:pic="http://schemas.openxmlformats.org/drawingml/2006/picture">
+                  <pic:nvPicPr>
+                    <pic:cNvPr id="955307068" name=""/>
+                    <pic:cNvPicPr/>
+                  </pic:nvPicPr>
+                  <pic:blipFill>
+                    <a:blip r:embed="rId10"/>
+                    <a:stretch>
+                      <a:fillRect/>
+                    </a:stretch>
+                  </pic:blipFill>
+                  <pic:spPr>
+                    <a:xfrm>
+                      <a:off x="0" y="0"/>
+                      <a:ext cx="5486400" cy="3216275"/>
+                    </a:xfrm>
+                    <a:prstGeom prst="rect">
+                      <a:avLst/>
+                    </a:prstGeom>
+                  </pic:spPr>
+                </pic:pic>
+              </a:graphicData>
+            </a:graphic>
+          </wp:inline>
+        </w:drawing>
+      </w:r>
+    </w:p>
     <w:p>
       <w:pPr>
         <w:pStyle w:val="Heading3"/>
       </w:pPr>
       <w:r>
         <w:lastRenderedPageBreak/>
-        <w:t>1 KB Frames — Page Faults (1.5 pts)</w:t>
+        <w:t>2 KB Frames — Page Faults (1.5 pts)</w:t>
       </w:r>
     </w:p>
     <w:p>
-      <w:pPr>
-        <w:jc w:val="center"/>
-      </w:pPr>
       <w:r>
         <w:rPr>
           <w:i/>
           <w:color w:val="888888"/>
         </w:rPr>
-        <w:t>[Insert 1 KB Page Faults chart here]</w:t>
+        <w:drawing>
+          <wp:inline distT="0" distB="0" distL="0" distR="0" wp14:anchorId="40A61398" wp14:editId="4C473F14">
+            <wp:extent cx="5486400" cy="3240405"/>
+            <wp:effectExtent l="0" t="0" r="0" b="0"/>
+            <wp:docPr id="1111778904" name="Picture 1"/>
+            <wp:cNvGraphicFramePr>
+              <a:graphicFrameLocks xmlns:a="http://schemas.openxmlformats.org/drawingml/2006/main" noChangeAspect="1"/>
+            </wp:cNvGraphicFramePr>
+            <a:graphic xmlns:a="http://schemas.openxmlformats.org/drawingml/2006/main">
+              <a:graphicData uri="http://schemas.openxmlformats.org/drawingml/2006/picture">
+                <pic:pic xmlns:pic="http://schemas.openxmlformats.org/drawingml/2006/picture">
+                  <pic:nvPicPr>
+                    <pic:cNvPr id="1111778904" name=""/>
+                    <pic:cNvPicPr/>
+                  </pic:nvPicPr>
+                  <pic:blipFill>
+                    <a:blip r:embed="rId11"/>
+                    <a:stretch>
+                      <a:fillRect/>
+                    </a:stretch>
+                  </pic:blipFill>
+                  <pic:spPr>
+                    <a:xfrm>
+                      <a:off x="0" y="0"/>
+                      <a:ext cx="5486400" cy="3240405"/>
+                    </a:xfrm>
+                    <a:prstGeom prst="rect">
+                      <a:avLst/>
+                    </a:prstGeom>
+                  </pic:spPr>
+                </pic:pic>
+              </a:graphicData>
+            </a:graphic>
+          </wp:inline>
+        </w:drawing>
       </w:r>
     </w:p>
-    <w:p/>
-    <w:p>
-      <w:pPr>
-        <w:pStyle w:val="Heading3"/>
-      </w:pPr>
-      <w:r>
-        <w:t>2 KB Frames — Page Faults (1.5 pts)</w:t>
-      </w:r>
-    </w:p>
-    <w:p>
-      <w:pPr>
-        <w:jc w:val="center"/>
-      </w:pPr>
-      <w:r>
-        <w:rPr>
-          <w:i/>
-          <w:color w:val="888888"/>
-        </w:rPr>
-        <w:t>[Insert 2 KB Page Faults chart here]</w:t>
-      </w:r>
-    </w:p>
-    <w:p/>
     <w:p>
       <w:pPr>
         <w:pStyle w:val="Heading3"/>
@@ -357,29 +504,55 @@
       </w:r>
     </w:p>
     <w:p>
-      <w:pPr>
-        <w:jc w:val="center"/>
-      </w:pPr>
       <w:r>
         <w:rPr>
           <w:i/>
           <w:color w:val="888888"/>
         </w:rPr>
-        <w:t>[Insert 4 KB Page Faults chart here]</w:t>
+        <w:drawing>
+          <wp:inline distT="0" distB="0" distL="0" distR="0" wp14:anchorId="49404CCE" wp14:editId="472A22DF">
+            <wp:extent cx="5486400" cy="3183255"/>
+            <wp:effectExtent l="0" t="0" r="0" b="0"/>
+            <wp:docPr id="188461373" name="Picture 1"/>
+            <wp:cNvGraphicFramePr>
+              <a:graphicFrameLocks xmlns:a="http://schemas.openxmlformats.org/drawingml/2006/main" noChangeAspect="1"/>
+            </wp:cNvGraphicFramePr>
+            <a:graphic xmlns:a="http://schemas.openxmlformats.org/drawingml/2006/main">
+              <a:graphicData uri="http://schemas.openxmlformats.org/drawingml/2006/picture">
+                <pic:pic xmlns:pic="http://schemas.openxmlformats.org/drawingml/2006/picture">
+                  <pic:nvPicPr>
+                    <pic:cNvPr id="188461373" name=""/>
+                    <pic:cNvPicPr/>
+                  </pic:nvPicPr>
+                  <pic:blipFill>
+                    <a:blip r:embed="rId12"/>
+                    <a:stretch>
+                      <a:fillRect/>
+                    </a:stretch>
+                  </pic:blipFill>
+                  <pic:spPr>
+                    <a:xfrm>
+                      <a:off x="0" y="0"/>
+                      <a:ext cx="5486400" cy="3183255"/>
+                    </a:xfrm>
+                    <a:prstGeom prst="rect">
+                      <a:avLst/>
+                    </a:prstGeom>
+                  </pic:spPr>
+                </pic:pic>
+              </a:graphicData>
+            </a:graphic>
+          </wp:inline>
+        </w:drawing>
       </w:r>
     </w:p>
-    <w:p/>
     <w:p>
       <w:pPr>
         <w:pStyle w:val="Heading1"/>
       </w:pPr>
       <w:r>
+        <w:lastRenderedPageBreak/>
         <w:t>4. Frames vs. Page-Fault Rate — 4 charts (6 pts)</w:t>
-      </w:r>
-    </w:p>
-    <w:p>
-      <w:r>
-        <w:t>Insert one chart per frame size showing Frames (x-axis) vs. Page-Fault Rate (y-axis). Each chart must include a horizontal reference line at 10% fault rate, descriptive title, and labeled axes. (1.5 pts per chart)</w:t>
       </w:r>
     </w:p>
     <w:p>
@@ -389,20 +562,48 @@
       <w:r>
         <w:t>512 B Frames — Fault Rate (1.5 pts)</w:t>
       </w:r>
-    </w:p>
-    <w:p>
-      <w:pPr>
-        <w:jc w:val="center"/>
-      </w:pPr>
       <w:r>
         <w:rPr>
           <w:i/>
           <w:color w:val="888888"/>
         </w:rPr>
-        <w:t>[Insert 512 B Fault Rate chart here — include 10% reference line]</w:t>
+        <w:drawing>
+          <wp:inline distT="0" distB="0" distL="0" distR="0" wp14:anchorId="61187BE5" wp14:editId="289F4B26">
+            <wp:extent cx="5486400" cy="3305175"/>
+            <wp:effectExtent l="0" t="0" r="0" b="9525"/>
+            <wp:docPr id="1895913116" name="Picture 1"/>
+            <wp:cNvGraphicFramePr>
+              <a:graphicFrameLocks xmlns:a="http://schemas.openxmlformats.org/drawingml/2006/main" noChangeAspect="1"/>
+            </wp:cNvGraphicFramePr>
+            <a:graphic xmlns:a="http://schemas.openxmlformats.org/drawingml/2006/main">
+              <a:graphicData uri="http://schemas.openxmlformats.org/drawingml/2006/picture">
+                <pic:pic xmlns:pic="http://schemas.openxmlformats.org/drawingml/2006/picture">
+                  <pic:nvPicPr>
+                    <pic:cNvPr id="1895913116" name=""/>
+                    <pic:cNvPicPr/>
+                  </pic:nvPicPr>
+                  <pic:blipFill>
+                    <a:blip r:embed="rId13"/>
+                    <a:stretch>
+                      <a:fillRect/>
+                    </a:stretch>
+                  </pic:blipFill>
+                  <pic:spPr>
+                    <a:xfrm>
+                      <a:off x="0" y="0"/>
+                      <a:ext cx="5486400" cy="3305175"/>
+                    </a:xfrm>
+                    <a:prstGeom prst="rect">
+                      <a:avLst/>
+                    </a:prstGeom>
+                  </pic:spPr>
+                </pic:pic>
+              </a:graphicData>
+            </a:graphic>
+          </wp:inline>
+        </w:drawing>
       </w:r>
     </w:p>
-    <w:p/>
     <w:p>
       <w:pPr>
         <w:pStyle w:val="Heading3"/>
@@ -412,39 +613,100 @@
       </w:r>
     </w:p>
     <w:p>
-      <w:pPr>
-        <w:jc w:val="center"/>
-      </w:pPr>
       <w:r>
         <w:rPr>
           <w:i/>
           <w:color w:val="888888"/>
         </w:rPr>
-        <w:t>[Insert 1 KB Fault Rate chart here — include 10% reference line]</w:t>
+        <w:drawing>
+          <wp:inline distT="0" distB="0" distL="0" distR="0" wp14:anchorId="7527755B" wp14:editId="54C4E564">
+            <wp:extent cx="5486400" cy="3249295"/>
+            <wp:effectExtent l="0" t="0" r="0" b="8255"/>
+            <wp:docPr id="1150906971" name="Picture 1"/>
+            <wp:cNvGraphicFramePr>
+              <a:graphicFrameLocks xmlns:a="http://schemas.openxmlformats.org/drawingml/2006/main" noChangeAspect="1"/>
+            </wp:cNvGraphicFramePr>
+            <a:graphic xmlns:a="http://schemas.openxmlformats.org/drawingml/2006/main">
+              <a:graphicData uri="http://schemas.openxmlformats.org/drawingml/2006/picture">
+                <pic:pic xmlns:pic="http://schemas.openxmlformats.org/drawingml/2006/picture">
+                  <pic:nvPicPr>
+                    <pic:cNvPr id="1150906971" name=""/>
+                    <pic:cNvPicPr/>
+                  </pic:nvPicPr>
+                  <pic:blipFill>
+                    <a:blip r:embed="rId14"/>
+                    <a:stretch>
+                      <a:fillRect/>
+                    </a:stretch>
+                  </pic:blipFill>
+                  <pic:spPr>
+                    <a:xfrm>
+                      <a:off x="0" y="0"/>
+                      <a:ext cx="5486400" cy="3249295"/>
+                    </a:xfrm>
+                    <a:prstGeom prst="rect">
+                      <a:avLst/>
+                    </a:prstGeom>
+                  </pic:spPr>
+                </pic:pic>
+              </a:graphicData>
+            </a:graphic>
+          </wp:inline>
+        </w:drawing>
       </w:r>
     </w:p>
-    <w:p/>
     <w:p>
       <w:pPr>
         <w:pStyle w:val="Heading3"/>
       </w:pPr>
       <w:r>
+        <w:lastRenderedPageBreak/>
         <w:t>2 KB Frames — Fault Rate (1.5 pts)</w:t>
       </w:r>
     </w:p>
     <w:p>
-      <w:pPr>
-        <w:jc w:val="center"/>
-      </w:pPr>
       <w:r>
         <w:rPr>
           <w:i/>
           <w:color w:val="888888"/>
         </w:rPr>
-        <w:t>[Insert 2 KB Fault Rate chart here — include 10% reference line]</w:t>
+        <w:drawing>
+          <wp:inline distT="0" distB="0" distL="0" distR="0" wp14:anchorId="216BC4E7" wp14:editId="7CBC3361">
+            <wp:extent cx="5486400" cy="3257550"/>
+            <wp:effectExtent l="0" t="0" r="0" b="0"/>
+            <wp:docPr id="212099106" name="Picture 1"/>
+            <wp:cNvGraphicFramePr>
+              <a:graphicFrameLocks xmlns:a="http://schemas.openxmlformats.org/drawingml/2006/main" noChangeAspect="1"/>
+            </wp:cNvGraphicFramePr>
+            <a:graphic xmlns:a="http://schemas.openxmlformats.org/drawingml/2006/main">
+              <a:graphicData uri="http://schemas.openxmlformats.org/drawingml/2006/picture">
+                <pic:pic xmlns:pic="http://schemas.openxmlformats.org/drawingml/2006/picture">
+                  <pic:nvPicPr>
+                    <pic:cNvPr id="212099106" name=""/>
+                    <pic:cNvPicPr/>
+                  </pic:nvPicPr>
+                  <pic:blipFill>
+                    <a:blip r:embed="rId15"/>
+                    <a:stretch>
+                      <a:fillRect/>
+                    </a:stretch>
+                  </pic:blipFill>
+                  <pic:spPr>
+                    <a:xfrm>
+                      <a:off x="0" y="0"/>
+                      <a:ext cx="5486400" cy="3257550"/>
+                    </a:xfrm>
+                    <a:prstGeom prst="rect">
+                      <a:avLst/>
+                    </a:prstGeom>
+                  </pic:spPr>
+                </pic:pic>
+              </a:graphicData>
+            </a:graphic>
+          </wp:inline>
+        </w:drawing>
       </w:r>
     </w:p>
-    <w:p/>
     <w:p>
       <w:pPr>
         <w:pStyle w:val="Heading3"/>
@@ -454,18 +716,48 @@
       </w:r>
     </w:p>
     <w:p>
-      <w:pPr>
-        <w:jc w:val="center"/>
-      </w:pPr>
       <w:r>
         <w:rPr>
           <w:i/>
           <w:color w:val="888888"/>
         </w:rPr>
-        <w:t>[Insert 4 KB Fault Rate chart here — include 10% reference line]</w:t>
+        <w:drawing>
+          <wp:inline distT="0" distB="0" distL="0" distR="0" wp14:anchorId="49659EB8" wp14:editId="59992C29">
+            <wp:extent cx="5486400" cy="3188970"/>
+            <wp:effectExtent l="0" t="0" r="0" b="0"/>
+            <wp:docPr id="2062560534" name="Picture 1"/>
+            <wp:cNvGraphicFramePr>
+              <a:graphicFrameLocks xmlns:a="http://schemas.openxmlformats.org/drawingml/2006/main" noChangeAspect="1"/>
+            </wp:cNvGraphicFramePr>
+            <a:graphic xmlns:a="http://schemas.openxmlformats.org/drawingml/2006/main">
+              <a:graphicData uri="http://schemas.openxmlformats.org/drawingml/2006/picture">
+                <pic:pic xmlns:pic="http://schemas.openxmlformats.org/drawingml/2006/picture">
+                  <pic:nvPicPr>
+                    <pic:cNvPr id="2062560534" name=""/>
+                    <pic:cNvPicPr/>
+                  </pic:nvPicPr>
+                  <pic:blipFill>
+                    <a:blip r:embed="rId16"/>
+                    <a:stretch>
+                      <a:fillRect/>
+                    </a:stretch>
+                  </pic:blipFill>
+                  <pic:spPr>
+                    <a:xfrm>
+                      <a:off x="0" y="0"/>
+                      <a:ext cx="5486400" cy="3188970"/>
+                    </a:xfrm>
+                    <a:prstGeom prst="rect">
+                      <a:avLst/>
+                    </a:prstGeom>
+                  </pic:spPr>
+                </pic:pic>
+              </a:graphicData>
+            </a:graphic>
+          </wp:inline>
+        </w:drawing>
       </w:r>
     </w:p>
-    <w:p/>
     <w:p>
       <w:pPr>
         <w:pStyle w:val="Heading1"/>
@@ -476,7 +768,27 @@
     </w:p>
     <w:p>
       <w:r>
-        <w:t>[Describe the shape of your fault-rate curves. Note the steep initial drop followed by flattening. Where does the inflection point occur for each frame size? What does the inflection point tell you about the process's working set size? Discuss any other interesting features you observe in the graphs.]</w:t>
+        <w:t xml:space="preserve">The curves all have a steep drop initially before quickly flattening out. The inflection </w:t>
+      </w:r>
+      <w:proofErr w:type="gramStart"/>
+      <w:r>
+        <w:t>point</w:t>
+      </w:r>
+      <w:proofErr w:type="gramEnd"/>
+      <w:r>
+        <w:t xml:space="preserve"> between a steep slope and the flattening out happens at around 25% fault rate for all curves, with them all crossing the 10% fault rate line at around 35% of the way to their max frames. The </w:t>
+      </w:r>
+      <w:r>
+        <w:lastRenderedPageBreak/>
+        <w:t xml:space="preserve">inflection point happens very early on, around 105 frames for 512b, 50 frames for 1kb, 35 frames for 2kb, and 27 frames for 4kb. These inflection points show where additional frames start to </w:t>
+      </w:r>
+      <w:proofErr w:type="gramStart"/>
+      <w:r>
+        <w:t>becoming</w:t>
+      </w:r>
+      <w:proofErr w:type="gramEnd"/>
+      <w:r>
+        <w:t xml:space="preserve"> inefficient for each frame size.</w:t>
       </w:r>
     </w:p>
     <w:p>
@@ -484,13 +796,20 @@
         <w:pStyle w:val="Heading1"/>
       </w:pPr>
       <w:r>
-        <w:lastRenderedPageBreak/>
         <w:t>6. Frame Size and Fault Rate Tradeoffs (5 pts)</w:t>
       </w:r>
     </w:p>
     <w:p>
       <w:r>
-        <w:t>[Discuss how larger frames reduce the number of distinct pages but increase internal fragmentation. Does your data support a preference for larger or smaller frames? What is the tradeoff between fewer faults (larger frames) and wasted memory (internal fragmentation)?]</w:t>
+        <w:t xml:space="preserve">Larger frames have more memory, but if the page they have doesn’t take up the full memory, then they have empty space that leads to internal fragmentation. The data shows a preference for 1kb and 2kb page sizes as they were the most efficient with their frame use, getting their fault rates below 10% faster than 512b and 4kb. Fewer faults </w:t>
+      </w:r>
+      <w:proofErr w:type="gramStart"/>
+      <w:r>
+        <w:t>leads</w:t>
+      </w:r>
+      <w:proofErr w:type="gramEnd"/>
+      <w:r>
+        <w:t xml:space="preserve"> to faster speeds on memory, but fragmentation leads to memory not being used efficiently meaning that it gets filled up faster.</w:t>
       </w:r>
     </w:p>
     <w:p>
@@ -13126,10 +13445,6 @@
 </file>
 
 <file path=customXml/item1.xml><?xml version="1.0" encoding="utf-8"?>
-<b:Sources xmlns:b="http://schemas.openxmlformats.org/officeDocument/2006/bibliography" xmlns="http://schemas.openxmlformats.org/officeDocument/2006/bibliography" SelectedStyle="/APA.XSL" StyleName="APA"/>
-</file>
-
-<file path=customXml/item2.xml><?xml version="1.0" encoding="utf-8"?>
 <p:properties xmlns:p="http://schemas.microsoft.com/office/2006/metadata/properties" xmlns:xsi="http://www.w3.org/2001/XMLSchema-instance" xmlns:pc="http://schemas.microsoft.com/office/infopath/2007/PartnerControls">
   <documentManagement>
     <_ip_UnifiedCompliancePolicyUIAction xmlns="http://schemas.microsoft.com/sharepoint/v3" xsi:nil="true"/>
@@ -13142,7 +13457,7 @@
 </p:properties>
 </file>
 
-<file path=customXml/item3.xml><?xml version="1.0" encoding="utf-8"?>
+<file path=customXml/item2.xml><?xml version="1.0" encoding="utf-8"?>
 <?mso-contentType ?>
 <FormTemplates xmlns="http://schemas.microsoft.com/sharepoint/v3/contenttype/forms">
   <Display>DocumentLibraryForm</Display>
@@ -13151,7 +13466,7 @@
 </FormTemplates>
 </file>
 
-<file path=customXml/item4.xml><?xml version="1.0" encoding="utf-8"?>
+<file path=customXml/item3.xml><?xml version="1.0" encoding="utf-8"?>
 <ct:contentTypeSchema xmlns:ct="http://schemas.microsoft.com/office/2006/metadata/contentType" xmlns:ma="http://schemas.microsoft.com/office/2006/metadata/properties/metaAttributes" ct:_="" ma:_="" ma:contentTypeName="Document" ma:contentTypeID="0x0101006A7D154A9B6B4745A92074A700A40869" ma:contentTypeVersion="24" ma:contentTypeDescription="Create a new document." ma:contentTypeScope="" ma:versionID="49c36a49e684e25092aa685b0fe35842">
   <xsd:schema xmlns:xsd="http://www.w3.org/2001/XMLSchema" xmlns:xs="http://www.w3.org/2001/XMLSchema" xmlns:p="http://schemas.microsoft.com/office/2006/metadata/properties" xmlns:ns1="http://schemas.microsoft.com/sharepoint/v3" xmlns:ns2="fcae3b96-bd14-4ee2-8386-a94084e60018" xmlns:ns3="56f87f42-bac6-49e2-b9d5-04744cb514ee" targetNamespace="http://schemas.microsoft.com/office/2006/metadata/properties" ma:root="true" ma:fieldsID="9c960b9d532a5d3a9032170b89435a2d" ns1:_="" ns2:_="" ns3:_="">
     <xsd:import namespace="http://schemas.microsoft.com/sharepoint/v3"/>
@@ -13429,15 +13744,11 @@
 </ct:contentTypeSchema>
 </file>
 
-<file path=customXml/itemProps1.xml><?xml version="1.0" encoding="utf-8"?>
-<ds:datastoreItem xmlns:ds="http://schemas.openxmlformats.org/officeDocument/2006/customXml" ds:itemID="{EF278816-EC6F-A645-907D-7F25AECB1D4A}">
-  <ds:schemaRefs>
-    <ds:schemaRef ds:uri="http://schemas.openxmlformats.org/officeDocument/2006/bibliography"/>
-  </ds:schemaRefs>
-</ds:datastoreItem>
+<file path=customXml/item4.xml><?xml version="1.0" encoding="utf-8"?>
+<b:Sources xmlns:b="http://schemas.openxmlformats.org/officeDocument/2006/bibliography" xmlns="http://schemas.openxmlformats.org/officeDocument/2006/bibliography" SelectedStyle="/APA.XSL" StyleName="APA"/>
 </file>
 
-<file path=customXml/itemProps2.xml><?xml version="1.0" encoding="utf-8"?>
+<file path=customXml/itemProps1.xml><?xml version="1.0" encoding="utf-8"?>
 <ds:datastoreItem xmlns:ds="http://schemas.openxmlformats.org/officeDocument/2006/customXml" ds:itemID="{94EDD69F-103F-4891-A1A7-DE0F9F4E28FD}">
   <ds:schemaRefs>
     <ds:schemaRef ds:uri="http://schemas.microsoft.com/office/2006/metadata/properties"/>
@@ -13449,7 +13760,7 @@
 </ds:datastoreItem>
 </file>
 
-<file path=customXml/itemProps3.xml><?xml version="1.0" encoding="utf-8"?>
+<file path=customXml/itemProps2.xml><?xml version="1.0" encoding="utf-8"?>
 <ds:datastoreItem xmlns:ds="http://schemas.openxmlformats.org/officeDocument/2006/customXml" ds:itemID="{CEDA4C41-BA4A-4F0B-A87E-F30AA6591D91}">
   <ds:schemaRefs>
     <ds:schemaRef ds:uri="http://schemas.microsoft.com/sharepoint/v3/contenttype/forms"/>
@@ -13457,7 +13768,7 @@
 </ds:datastoreItem>
 </file>
 
-<file path=customXml/itemProps4.xml><?xml version="1.0" encoding="utf-8"?>
+<file path=customXml/itemProps3.xml><?xml version="1.0" encoding="utf-8"?>
 <ds:datastoreItem xmlns:ds="http://schemas.openxmlformats.org/officeDocument/2006/customXml" ds:itemID="{131969F9-69E6-4531-89F9-CCA743737436}">
   <ds:schemaRefs>
     <ds:schemaRef ds:uri="http://schemas.microsoft.com/office/2006/metadata/contentType"/>
@@ -13477,6 +13788,14 @@
 </ds:datastoreItem>
 </file>
 
+<file path=customXml/itemProps4.xml><?xml version="1.0" encoding="utf-8"?>
+<ds:datastoreItem xmlns:ds="http://schemas.openxmlformats.org/officeDocument/2006/customXml" ds:itemID="{EF278816-EC6F-A645-907D-7F25AECB1D4A}">
+  <ds:schemaRefs>
+    <ds:schemaRef ds:uri="http://schemas.openxmlformats.org/officeDocument/2006/bibliography"/>
+  </ds:schemaRefs>
+</ds:datastoreItem>
+</file>
+
 <file path=docMetadata/LabelInfo.xml><?xml version="1.0" encoding="utf-8"?>
 <clbl:labelList xmlns:clbl="http://schemas.microsoft.com/office/2020/mipLabelMetadata">
   <clbl:label id="{7ab80a06-f029-45c0-84d1-7dad19ce3c61}" enabled="0" method="" siteId="{7ab80a06-f029-45c0-84d1-7dad19ce3c61}" removed="1"/>

</xml_diff>

<commit_message>
New byutr.h file used, report fixed
</commit_message>
<xml_diff>
--- a/PEX3_Report_Template.docx
+++ b/PEX3_Report_Template.docx
@@ -65,42 +65,19 @@
     </w:p>
     <w:p>
       <w:r>
-        <w:t>A frame size of 1kb is recommended because it only needs</w:t>
+        <w:t xml:space="preserve">A frame size of 1kb is recommended because it only needs </w:t>
       </w:r>
       <w:r>
-        <w:t xml:space="preserve"> 32.2% of its maximum frames </w:t>
+        <w:t>7.76</w:t>
       </w:r>
-      <w:proofErr w:type="gramStart"/>
       <w:r>
-        <w:t>in order to</w:t>
+        <w:t xml:space="preserve">% of its maximum frames in order to have a fault rate below 10%. This is the lowest out of all of the frame sizes tested, making it the best in order to have a low fault rate while still keeping memory overhead low. The recommended number of frames is </w:t>
       </w:r>
-      <w:proofErr w:type="gramEnd"/>
       <w:r>
-        <w:t xml:space="preserve"> have a fault rate below 10%. This is the lowest out of </w:t>
+        <w:t>318</w:t>
       </w:r>
-      <w:proofErr w:type="gramStart"/>
       <w:r>
-        <w:t>all of</w:t>
-      </w:r>
-      <w:proofErr w:type="gramEnd"/>
-      <w:r>
-        <w:t xml:space="preserve"> the frame sizes tested, making it the best </w:t>
-      </w:r>
-      <w:proofErr w:type="gramStart"/>
-      <w:r>
-        <w:t>in order to</w:t>
-      </w:r>
-      <w:proofErr w:type="gramEnd"/>
-      <w:r>
-        <w:t xml:space="preserve"> have a low fault rate while </w:t>
-      </w:r>
-      <w:proofErr w:type="gramStart"/>
-      <w:r>
-        <w:t>still keeping</w:t>
-      </w:r>
-      <w:proofErr w:type="gramEnd"/>
-      <w:r>
-        <w:t xml:space="preserve"> memory overhead low. The recommended number of frames is 1319 because that is when the fault rate falls below 10%, and this also has the lowest memory overhead allowing better performance.</w:t>
+        <w:t xml:space="preserve"> because that is when the fault rate falls below 10%, and this also has the lowest memory overhead allowing better performance.</w:t>
       </w:r>
     </w:p>
     <w:p>
@@ -191,7 +168,7 @@
               <w:cnfStyle w:val="000000100000" w:firstRow="0" w:lastRow="0" w:firstColumn="0" w:lastColumn="0" w:oddVBand="0" w:evenVBand="0" w:oddHBand="1" w:evenHBand="0" w:firstRowFirstColumn="0" w:firstRowLastColumn="0" w:lastRowFirstColumn="0" w:lastRowLastColumn="0"/>
             </w:pPr>
             <w:r>
-              <w:t>2974</w:t>
+              <w:t>689</w:t>
             </w:r>
           </w:p>
         </w:tc>
@@ -204,7 +181,7 @@
               <w:cnfStyle w:val="000000100000" w:firstRow="0" w:lastRow="0" w:firstColumn="0" w:lastColumn="0" w:oddVBand="0" w:evenVBand="0" w:oddHBand="1" w:evenHBand="0" w:firstRowFirstColumn="0" w:firstRowLastColumn="0" w:lastRowFirstColumn="0" w:lastRowLastColumn="0"/>
             </w:pPr>
             <w:r>
-              <w:t>0.099990</w:t>
+              <w:t>0.09996</w:t>
             </w:r>
           </w:p>
         </w:tc>
@@ -234,7 +211,7 @@
               <w:cnfStyle w:val="000000010000" w:firstRow="0" w:lastRow="0" w:firstColumn="0" w:lastColumn="0" w:oddVBand="0" w:evenVBand="0" w:oddHBand="0" w:evenHBand="1" w:firstRowFirstColumn="0" w:firstRowLastColumn="0" w:lastRowFirstColumn="0" w:lastRowLastColumn="0"/>
             </w:pPr>
             <w:r>
-              <w:t>1319</w:t>
+              <w:t>318</w:t>
             </w:r>
           </w:p>
         </w:tc>
@@ -247,7 +224,7 @@
               <w:cnfStyle w:val="000000010000" w:firstRow="0" w:lastRow="0" w:firstColumn="0" w:lastColumn="0" w:oddVBand="0" w:evenVBand="0" w:oddHBand="0" w:evenHBand="1" w:firstRowFirstColumn="0" w:firstRowLastColumn="0" w:lastRowFirstColumn="0" w:lastRowLastColumn="0"/>
             </w:pPr>
             <w:r>
-              <w:t>0.099995</w:t>
+              <w:t>0.099937</w:t>
             </w:r>
           </w:p>
         </w:tc>
@@ -277,7 +254,7 @@
               <w:cnfStyle w:val="000000100000" w:firstRow="0" w:lastRow="0" w:firstColumn="0" w:lastColumn="0" w:oddVBand="0" w:evenVBand="0" w:oddHBand="1" w:evenHBand="0" w:firstRowFirstColumn="0" w:firstRowLastColumn="0" w:lastRowFirstColumn="0" w:lastRowLastColumn="0"/>
             </w:pPr>
             <w:r>
-              <w:t>685</w:t>
+              <w:t>179</w:t>
             </w:r>
           </w:p>
         </w:tc>
@@ -290,7 +267,7 @@
               <w:cnfStyle w:val="000000100000" w:firstRow="0" w:lastRow="0" w:firstColumn="0" w:lastColumn="0" w:oddVBand="0" w:evenVBand="0" w:oddHBand="1" w:evenHBand="0" w:firstRowFirstColumn="0" w:firstRowLastColumn="0" w:lastRowFirstColumn="0" w:lastRowLastColumn="0"/>
             </w:pPr>
             <w:r>
-              <w:t>0.099946</w:t>
+              <w:t>0.099777</w:t>
             </w:r>
           </w:p>
         </w:tc>
@@ -320,7 +297,7 @@
               <w:cnfStyle w:val="000000010000" w:firstRow="0" w:lastRow="0" w:firstColumn="0" w:lastColumn="0" w:oddVBand="0" w:evenVBand="0" w:oddHBand="0" w:evenHBand="1" w:firstRowFirstColumn="0" w:firstRowLastColumn="0" w:lastRowFirstColumn="0" w:lastRowLastColumn="0"/>
             </w:pPr>
             <w:r>
-              <w:t>380</w:t>
+              <w:t>106</w:t>
             </w:r>
           </w:p>
         </w:tc>
@@ -333,7 +310,7 @@
               <w:cnfStyle w:val="000000010000" w:firstRow="0" w:lastRow="0" w:firstColumn="0" w:lastColumn="0" w:oddVBand="0" w:evenVBand="0" w:oddHBand="0" w:evenHBand="1" w:firstRowFirstColumn="0" w:firstRowLastColumn="0" w:lastRowFirstColumn="0" w:lastRowLastColumn="0"/>
             </w:pPr>
             <w:r>
-              <w:t>0.099904</w:t>
+              <w:t>0.099938</w:t>
             </w:r>
           </w:p>
         </w:tc>
@@ -360,10 +337,10 @@
     <w:p>
       <w:r>
         <w:drawing>
-          <wp:inline distT="0" distB="0" distL="0" distR="0" wp14:anchorId="5F0914CF" wp14:editId="3BCE4F44">
-            <wp:extent cx="5486400" cy="3308350"/>
-            <wp:effectExtent l="0" t="0" r="0" b="6350"/>
-            <wp:docPr id="1491412833" name="Picture 1"/>
+          <wp:inline distT="0" distB="0" distL="0" distR="0" wp14:anchorId="31C292CC" wp14:editId="5EC39FE5">
+            <wp:extent cx="5486400" cy="3288665"/>
+            <wp:effectExtent l="0" t="0" r="0" b="6985"/>
+            <wp:docPr id="1034044996" name="Picture 1"/>
             <wp:cNvGraphicFramePr>
               <a:graphicFrameLocks xmlns:a="http://schemas.openxmlformats.org/drawingml/2006/main" noChangeAspect="1"/>
             </wp:cNvGraphicFramePr>
@@ -371,7 +348,7 @@
               <a:graphicData uri="http://schemas.openxmlformats.org/drawingml/2006/picture">
                 <pic:pic xmlns:pic="http://schemas.openxmlformats.org/drawingml/2006/picture">
                   <pic:nvPicPr>
-                    <pic:cNvPr id="1491412833" name=""/>
+                    <pic:cNvPr id="1034044996" name=""/>
                     <pic:cNvPicPr/>
                   </pic:nvPicPr>
                   <pic:blipFill>
@@ -383,7 +360,7 @@
                   <pic:spPr>
                     <a:xfrm>
                       <a:off x="0" y="0"/>
-                      <a:ext cx="5486400" cy="3308350"/>
+                      <a:ext cx="5486400" cy="3288665"/>
                     </a:xfrm>
                     <a:prstGeom prst="rect">
                       <a:avLst/>
@@ -407,10 +384,10 @@
     <w:p>
       <w:r>
         <w:drawing>
-          <wp:inline distT="0" distB="0" distL="0" distR="0" wp14:anchorId="2585E64C" wp14:editId="7B152EFA">
-            <wp:extent cx="5486400" cy="3216275"/>
-            <wp:effectExtent l="0" t="0" r="0" b="3175"/>
-            <wp:docPr id="955307068" name="Picture 1"/>
+          <wp:inline distT="0" distB="0" distL="0" distR="0" wp14:anchorId="195A0D22" wp14:editId="482EBEC0">
+            <wp:extent cx="5486400" cy="3280410"/>
+            <wp:effectExtent l="0" t="0" r="0" b="0"/>
+            <wp:docPr id="1610086456" name="Picture 1"/>
             <wp:cNvGraphicFramePr>
               <a:graphicFrameLocks xmlns:a="http://schemas.openxmlformats.org/drawingml/2006/main" noChangeAspect="1"/>
             </wp:cNvGraphicFramePr>
@@ -418,7 +395,7 @@
               <a:graphicData uri="http://schemas.openxmlformats.org/drawingml/2006/picture">
                 <pic:pic xmlns:pic="http://schemas.openxmlformats.org/drawingml/2006/picture">
                   <pic:nvPicPr>
-                    <pic:cNvPr id="955307068" name=""/>
+                    <pic:cNvPr id="1610086456" name=""/>
                     <pic:cNvPicPr/>
                   </pic:nvPicPr>
                   <pic:blipFill>
@@ -430,7 +407,7 @@
                   <pic:spPr>
                     <a:xfrm>
                       <a:off x="0" y="0"/>
-                      <a:ext cx="5486400" cy="3216275"/>
+                      <a:ext cx="5486400" cy="3280410"/>
                     </a:xfrm>
                     <a:prstGeom prst="rect">
                       <a:avLst/>
@@ -454,15 +431,11 @@
     </w:p>
     <w:p>
       <w:r>
-        <w:rPr>
-          <w:i/>
-          <w:color w:val="888888"/>
-        </w:rPr>
         <w:drawing>
-          <wp:inline distT="0" distB="0" distL="0" distR="0" wp14:anchorId="40A61398" wp14:editId="4C473F14">
-            <wp:extent cx="5486400" cy="3240405"/>
+          <wp:inline distT="0" distB="0" distL="0" distR="0" wp14:anchorId="3668E2C5" wp14:editId="3BE47031">
+            <wp:extent cx="5486400" cy="3319145"/>
             <wp:effectExtent l="0" t="0" r="0" b="0"/>
-            <wp:docPr id="1111778904" name="Picture 1"/>
+            <wp:docPr id="1462764256" name="Picture 1"/>
             <wp:cNvGraphicFramePr>
               <a:graphicFrameLocks xmlns:a="http://schemas.openxmlformats.org/drawingml/2006/main" noChangeAspect="1"/>
             </wp:cNvGraphicFramePr>
@@ -470,7 +443,7 @@
               <a:graphicData uri="http://schemas.openxmlformats.org/drawingml/2006/picture">
                 <pic:pic xmlns:pic="http://schemas.openxmlformats.org/drawingml/2006/picture">
                   <pic:nvPicPr>
-                    <pic:cNvPr id="1111778904" name=""/>
+                    <pic:cNvPr id="1462764256" name=""/>
                     <pic:cNvPicPr/>
                   </pic:nvPicPr>
                   <pic:blipFill>
@@ -482,7 +455,7 @@
                   <pic:spPr>
                     <a:xfrm>
                       <a:off x="0" y="0"/>
-                      <a:ext cx="5486400" cy="3240405"/>
+                      <a:ext cx="5486400" cy="3319145"/>
                     </a:xfrm>
                     <a:prstGeom prst="rect">
                       <a:avLst/>
@@ -505,15 +478,11 @@
     </w:p>
     <w:p>
       <w:r>
-        <w:rPr>
-          <w:i/>
-          <w:color w:val="888888"/>
-        </w:rPr>
         <w:drawing>
-          <wp:inline distT="0" distB="0" distL="0" distR="0" wp14:anchorId="49404CCE" wp14:editId="472A22DF">
-            <wp:extent cx="5486400" cy="3183255"/>
-            <wp:effectExtent l="0" t="0" r="0" b="0"/>
-            <wp:docPr id="188461373" name="Picture 1"/>
+          <wp:inline distT="0" distB="0" distL="0" distR="0" wp14:anchorId="421420B6" wp14:editId="478B1718">
+            <wp:extent cx="5486400" cy="3269615"/>
+            <wp:effectExtent l="0" t="0" r="0" b="6985"/>
+            <wp:docPr id="231751843" name="Picture 1"/>
             <wp:cNvGraphicFramePr>
               <a:graphicFrameLocks xmlns:a="http://schemas.openxmlformats.org/drawingml/2006/main" noChangeAspect="1"/>
             </wp:cNvGraphicFramePr>
@@ -521,7 +490,7 @@
               <a:graphicData uri="http://schemas.openxmlformats.org/drawingml/2006/picture">
                 <pic:pic xmlns:pic="http://schemas.openxmlformats.org/drawingml/2006/picture">
                   <pic:nvPicPr>
-                    <pic:cNvPr id="188461373" name=""/>
+                    <pic:cNvPr id="231751843" name=""/>
                     <pic:cNvPicPr/>
                   </pic:nvPicPr>
                   <pic:blipFill>
@@ -533,7 +502,7 @@
                   <pic:spPr>
                     <a:xfrm>
                       <a:off x="0" y="0"/>
-                      <a:ext cx="5486400" cy="3183255"/>
+                      <a:ext cx="5486400" cy="3269615"/>
                     </a:xfrm>
                     <a:prstGeom prst="rect">
                       <a:avLst/>
@@ -564,14 +533,16 @@
       </w:r>
       <w:r>
         <w:rPr>
-          <w:i/>
-          <w:color w:val="888888"/>
+          <w:noProof/>
         </w:rPr>
+        <w:t xml:space="preserve"> </w:t>
+      </w:r>
+      <w:r>
         <w:drawing>
-          <wp:inline distT="0" distB="0" distL="0" distR="0" wp14:anchorId="61187BE5" wp14:editId="289F4B26">
-            <wp:extent cx="5486400" cy="3305175"/>
-            <wp:effectExtent l="0" t="0" r="0" b="9525"/>
-            <wp:docPr id="1895913116" name="Picture 1"/>
+          <wp:inline distT="0" distB="0" distL="0" distR="0" wp14:anchorId="317E65D1" wp14:editId="6FCBF1FE">
+            <wp:extent cx="5486400" cy="3254375"/>
+            <wp:effectExtent l="0" t="0" r="0" b="3175"/>
+            <wp:docPr id="1978761756" name="Picture 1"/>
             <wp:cNvGraphicFramePr>
               <a:graphicFrameLocks xmlns:a="http://schemas.openxmlformats.org/drawingml/2006/main" noChangeAspect="1"/>
             </wp:cNvGraphicFramePr>
@@ -579,7 +550,7 @@
               <a:graphicData uri="http://schemas.openxmlformats.org/drawingml/2006/picture">
                 <pic:pic xmlns:pic="http://schemas.openxmlformats.org/drawingml/2006/picture">
                   <pic:nvPicPr>
-                    <pic:cNvPr id="1895913116" name=""/>
+                    <pic:cNvPr id="1978761756" name=""/>
                     <pic:cNvPicPr/>
                   </pic:nvPicPr>
                   <pic:blipFill>
@@ -591,7 +562,7 @@
                   <pic:spPr>
                     <a:xfrm>
                       <a:off x="0" y="0"/>
-                      <a:ext cx="5486400" cy="3305175"/>
+                      <a:ext cx="5486400" cy="3254375"/>
                     </a:xfrm>
                     <a:prstGeom prst="rect">
                       <a:avLst/>
@@ -614,15 +585,11 @@
     </w:p>
     <w:p>
       <w:r>
-        <w:rPr>
-          <w:i/>
-          <w:color w:val="888888"/>
-        </w:rPr>
         <w:drawing>
-          <wp:inline distT="0" distB="0" distL="0" distR="0" wp14:anchorId="7527755B" wp14:editId="54C4E564">
-            <wp:extent cx="5486400" cy="3249295"/>
-            <wp:effectExtent l="0" t="0" r="0" b="8255"/>
-            <wp:docPr id="1150906971" name="Picture 1"/>
+          <wp:inline distT="0" distB="0" distL="0" distR="0" wp14:anchorId="36097198" wp14:editId="33190C52">
+            <wp:extent cx="5486400" cy="3275965"/>
+            <wp:effectExtent l="0" t="0" r="0" b="635"/>
+            <wp:docPr id="2091184052" name="Picture 1"/>
             <wp:cNvGraphicFramePr>
               <a:graphicFrameLocks xmlns:a="http://schemas.openxmlformats.org/drawingml/2006/main" noChangeAspect="1"/>
             </wp:cNvGraphicFramePr>
@@ -630,7 +597,7 @@
               <a:graphicData uri="http://schemas.openxmlformats.org/drawingml/2006/picture">
                 <pic:pic xmlns:pic="http://schemas.openxmlformats.org/drawingml/2006/picture">
                   <pic:nvPicPr>
-                    <pic:cNvPr id="1150906971" name=""/>
+                    <pic:cNvPr id="2091184052" name=""/>
                     <pic:cNvPicPr/>
                   </pic:nvPicPr>
                   <pic:blipFill>
@@ -642,7 +609,7 @@
                   <pic:spPr>
                     <a:xfrm>
                       <a:off x="0" y="0"/>
-                      <a:ext cx="5486400" cy="3249295"/>
+                      <a:ext cx="5486400" cy="3275965"/>
                     </a:xfrm>
                     <a:prstGeom prst="rect">
                       <a:avLst/>
@@ -666,15 +633,11 @@
     </w:p>
     <w:p>
       <w:r>
-        <w:rPr>
-          <w:i/>
-          <w:color w:val="888888"/>
-        </w:rPr>
         <w:drawing>
-          <wp:inline distT="0" distB="0" distL="0" distR="0" wp14:anchorId="216BC4E7" wp14:editId="7CBC3361">
-            <wp:extent cx="5486400" cy="3257550"/>
+          <wp:inline distT="0" distB="0" distL="0" distR="0" wp14:anchorId="03936F64" wp14:editId="6D675EB4">
+            <wp:extent cx="5486400" cy="3266440"/>
             <wp:effectExtent l="0" t="0" r="0" b="0"/>
-            <wp:docPr id="212099106" name="Picture 1"/>
+            <wp:docPr id="553245849" name="Picture 1"/>
             <wp:cNvGraphicFramePr>
               <a:graphicFrameLocks xmlns:a="http://schemas.openxmlformats.org/drawingml/2006/main" noChangeAspect="1"/>
             </wp:cNvGraphicFramePr>
@@ -682,7 +645,7 @@
               <a:graphicData uri="http://schemas.openxmlformats.org/drawingml/2006/picture">
                 <pic:pic xmlns:pic="http://schemas.openxmlformats.org/drawingml/2006/picture">
                   <pic:nvPicPr>
-                    <pic:cNvPr id="212099106" name=""/>
+                    <pic:cNvPr id="553245849" name=""/>
                     <pic:cNvPicPr/>
                   </pic:nvPicPr>
                   <pic:blipFill>
@@ -694,7 +657,7 @@
                   <pic:spPr>
                     <a:xfrm>
                       <a:off x="0" y="0"/>
-                      <a:ext cx="5486400" cy="3257550"/>
+                      <a:ext cx="5486400" cy="3266440"/>
                     </a:xfrm>
                     <a:prstGeom prst="rect">
                       <a:avLst/>
@@ -717,15 +680,11 @@
     </w:p>
     <w:p>
       <w:r>
-        <w:rPr>
-          <w:i/>
-          <w:color w:val="888888"/>
-        </w:rPr>
         <w:drawing>
-          <wp:inline distT="0" distB="0" distL="0" distR="0" wp14:anchorId="49659EB8" wp14:editId="59992C29">
-            <wp:extent cx="5486400" cy="3188970"/>
+          <wp:inline distT="0" distB="0" distL="0" distR="0" wp14:anchorId="2F04C7E1" wp14:editId="330A54CF">
+            <wp:extent cx="5486400" cy="3240405"/>
             <wp:effectExtent l="0" t="0" r="0" b="0"/>
-            <wp:docPr id="2062560534" name="Picture 1"/>
+            <wp:docPr id="832821255" name="Picture 1"/>
             <wp:cNvGraphicFramePr>
               <a:graphicFrameLocks xmlns:a="http://schemas.openxmlformats.org/drawingml/2006/main" noChangeAspect="1"/>
             </wp:cNvGraphicFramePr>
@@ -733,7 +692,7 @@
               <a:graphicData uri="http://schemas.openxmlformats.org/drawingml/2006/picture">
                 <pic:pic xmlns:pic="http://schemas.openxmlformats.org/drawingml/2006/picture">
                   <pic:nvPicPr>
-                    <pic:cNvPr id="2062560534" name=""/>
+                    <pic:cNvPr id="832821255" name=""/>
                     <pic:cNvPicPr/>
                   </pic:nvPicPr>
                   <pic:blipFill>
@@ -745,7 +704,7 @@
                   <pic:spPr>
                     <a:xfrm>
                       <a:off x="0" y="0"/>
-                      <a:ext cx="5486400" cy="3188970"/>
+                      <a:ext cx="5486400" cy="3240405"/>
                     </a:xfrm>
                     <a:prstGeom prst="rect">
                       <a:avLst/>
@@ -768,25 +727,51 @@
     </w:p>
     <w:p>
       <w:r>
-        <w:t xml:space="preserve">The curves all have a steep drop initially before quickly flattening out. The inflection </w:t>
+        <w:t xml:space="preserve">The curves all have a steep drop initially before quickly flattening out. The inflection point between a steep slope and the flattening out happens at around </w:t>
       </w:r>
-      <w:proofErr w:type="gramStart"/>
       <w:r>
-        <w:t>point</w:t>
+        <w:t>1</w:t>
       </w:r>
-      <w:proofErr w:type="gramEnd"/>
       <w:r>
-        <w:t xml:space="preserve"> between a steep slope and the flattening out happens at around 25% fault rate for all curves, with them all crossing the 10% fault rate line at around 35% of the way to their max frames. The </w:t>
+        <w:t xml:space="preserve">5% fault rate for all curves, with them all crossing the 10% fault rate line at around </w:t>
+      </w:r>
+      <w:r>
+        <w:t>8-9</w:t>
+      </w:r>
+      <w:r>
+        <w:t xml:space="preserve">% of the way to their max frames. </w:t>
       </w:r>
       <w:r>
         <w:lastRenderedPageBreak/>
-        <w:t xml:space="preserve">inflection point happens very early on, around 105 frames for 512b, 50 frames for 1kb, 35 frames for 2kb, and 27 frames for 4kb. These inflection points show where additional frames start to </w:t>
+        <w:t xml:space="preserve">The inflection point happens very early on, around </w:t>
       </w:r>
-      <w:proofErr w:type="gramStart"/>
       <w:r>
-        <w:t>becoming</w:t>
+        <w:t>230</w:t>
       </w:r>
-      <w:proofErr w:type="gramEnd"/>
+      <w:r>
+        <w:t xml:space="preserve"> frames for 512b, </w:t>
+      </w:r>
+      <w:r>
+        <w:t>120</w:t>
+      </w:r>
+      <w:r>
+        <w:t xml:space="preserve"> frames for 1kb, </w:t>
+      </w:r>
+      <w:r>
+        <w:t>70</w:t>
+      </w:r>
+      <w:r>
+        <w:t xml:space="preserve"> frames for 2kb, and </w:t>
+      </w:r>
+      <w:r>
+        <w:t>50</w:t>
+      </w:r>
+      <w:r>
+        <w:t xml:space="preserve"> frames for 4kb. These inflection points show where additional frames start to </w:t>
+      </w:r>
+      <w:r>
+        <w:t>become</w:t>
+      </w:r>
       <w:r>
         <w:t xml:space="preserve"> inefficient for each frame size.</w:t>
       </w:r>
@@ -801,15 +786,19 @@
     </w:p>
     <w:p>
       <w:r>
-        <w:t xml:space="preserve">Larger frames have more memory, but if the page they have doesn’t take up the full memory, then they have empty space that leads to internal fragmentation. The data shows a preference for 1kb and 2kb page sizes as they were the most efficient with their frame use, getting their fault rates below 10% faster than 512b and 4kb. Fewer faults </w:t>
+        <w:t xml:space="preserve">Larger frames have more memory, but if the page they have doesn’t take up the full memory, then they have empty space that leads to internal fragmentation. The data shows a preference for </w:t>
       </w:r>
-      <w:proofErr w:type="gramStart"/>
       <w:r>
-        <w:t>leads</w:t>
+        <w:t>smaller</w:t>
       </w:r>
-      <w:proofErr w:type="gramEnd"/>
       <w:r>
-        <w:t xml:space="preserve"> to faster speeds on memory, but fragmentation leads to memory not being used efficiently meaning that it gets filled up faster.</w:t>
+        <w:t xml:space="preserve"> page sizes as they were the most efficient with their frame use, getting their fault rates below 10% faster than </w:t>
+      </w:r>
+      <w:r>
+        <w:t>2kb</w:t>
+      </w:r>
+      <w:r>
+        <w:t xml:space="preserve"> and 4kb. Fewer faults leads to faster speeds on memory, but fragmentation leads to memory not being used efficiently meaning that it gets filled up faster.</w:t>
       </w:r>
     </w:p>
     <w:p>
@@ -13445,6 +13434,15 @@
 </file>
 
 <file path=customXml/item1.xml><?xml version="1.0" encoding="utf-8"?>
+<?mso-contentType ?>
+<FormTemplates xmlns="http://schemas.microsoft.com/sharepoint/v3/contenttype/forms">
+  <Display>DocumentLibraryForm</Display>
+  <Edit>DocumentLibraryForm</Edit>
+  <New>DocumentLibraryForm</New>
+</FormTemplates>
+</file>
+
+<file path=customXml/item2.xml><?xml version="1.0" encoding="utf-8"?>
 <p:properties xmlns:p="http://schemas.microsoft.com/office/2006/metadata/properties" xmlns:xsi="http://www.w3.org/2001/XMLSchema-instance" xmlns:pc="http://schemas.microsoft.com/office/infopath/2007/PartnerControls">
   <documentManagement>
     <_ip_UnifiedCompliancePolicyUIAction xmlns="http://schemas.microsoft.com/sharepoint/v3" xsi:nil="true"/>
@@ -13457,16 +13455,11 @@
 </p:properties>
 </file>
 
-<file path=customXml/item2.xml><?xml version="1.0" encoding="utf-8"?>
-<?mso-contentType ?>
-<FormTemplates xmlns="http://schemas.microsoft.com/sharepoint/v3/contenttype/forms">
-  <Display>DocumentLibraryForm</Display>
-  <Edit>DocumentLibraryForm</Edit>
-  <New>DocumentLibraryForm</New>
-</FormTemplates>
+<file path=customXml/item3.xml><?xml version="1.0" encoding="utf-8"?>
+<b:Sources xmlns:b="http://schemas.openxmlformats.org/officeDocument/2006/bibliography" xmlns="http://schemas.openxmlformats.org/officeDocument/2006/bibliography" SelectedStyle="/APA.XSL" StyleName="APA"/>
 </file>
 
-<file path=customXml/item3.xml><?xml version="1.0" encoding="utf-8"?>
+<file path=customXml/item4.xml><?xml version="1.0" encoding="utf-8"?>
 <ct:contentTypeSchema xmlns:ct="http://schemas.microsoft.com/office/2006/metadata/contentType" xmlns:ma="http://schemas.microsoft.com/office/2006/metadata/properties/metaAttributes" ct:_="" ma:_="" ma:contentTypeName="Document" ma:contentTypeID="0x0101006A7D154A9B6B4745A92074A700A40869" ma:contentTypeVersion="24" ma:contentTypeDescription="Create a new document." ma:contentTypeScope="" ma:versionID="49c36a49e684e25092aa685b0fe35842">
   <xsd:schema xmlns:xsd="http://www.w3.org/2001/XMLSchema" xmlns:xs="http://www.w3.org/2001/XMLSchema" xmlns:p="http://schemas.microsoft.com/office/2006/metadata/properties" xmlns:ns1="http://schemas.microsoft.com/sharepoint/v3" xmlns:ns2="fcae3b96-bd14-4ee2-8386-a94084e60018" xmlns:ns3="56f87f42-bac6-49e2-b9d5-04744cb514ee" targetNamespace="http://schemas.microsoft.com/office/2006/metadata/properties" ma:root="true" ma:fieldsID="9c960b9d532a5d3a9032170b89435a2d" ns1:_="" ns2:_="" ns3:_="">
     <xsd:import namespace="http://schemas.microsoft.com/sharepoint/v3"/>
@@ -13744,11 +13737,15 @@
 </ct:contentTypeSchema>
 </file>
 
-<file path=customXml/item4.xml><?xml version="1.0" encoding="utf-8"?>
-<b:Sources xmlns:b="http://schemas.openxmlformats.org/officeDocument/2006/bibliography" xmlns="http://schemas.openxmlformats.org/officeDocument/2006/bibliography" SelectedStyle="/APA.XSL" StyleName="APA"/>
+<file path=customXml/itemProps1.xml><?xml version="1.0" encoding="utf-8"?>
+<ds:datastoreItem xmlns:ds="http://schemas.openxmlformats.org/officeDocument/2006/customXml" ds:itemID="{CEDA4C41-BA4A-4F0B-A87E-F30AA6591D91}">
+  <ds:schemaRefs>
+    <ds:schemaRef ds:uri="http://schemas.microsoft.com/sharepoint/v3/contenttype/forms"/>
+  </ds:schemaRefs>
+</ds:datastoreItem>
 </file>
 
-<file path=customXml/itemProps1.xml><?xml version="1.0" encoding="utf-8"?>
+<file path=customXml/itemProps2.xml><?xml version="1.0" encoding="utf-8"?>
 <ds:datastoreItem xmlns:ds="http://schemas.openxmlformats.org/officeDocument/2006/customXml" ds:itemID="{94EDD69F-103F-4891-A1A7-DE0F9F4E28FD}">
   <ds:schemaRefs>
     <ds:schemaRef ds:uri="http://schemas.microsoft.com/office/2006/metadata/properties"/>
@@ -13760,15 +13757,15 @@
 </ds:datastoreItem>
 </file>
 
-<file path=customXml/itemProps2.xml><?xml version="1.0" encoding="utf-8"?>
-<ds:datastoreItem xmlns:ds="http://schemas.openxmlformats.org/officeDocument/2006/customXml" ds:itemID="{CEDA4C41-BA4A-4F0B-A87E-F30AA6591D91}">
+<file path=customXml/itemProps3.xml><?xml version="1.0" encoding="utf-8"?>
+<ds:datastoreItem xmlns:ds="http://schemas.openxmlformats.org/officeDocument/2006/customXml" ds:itemID="{EF278816-EC6F-A645-907D-7F25AECB1D4A}">
   <ds:schemaRefs>
-    <ds:schemaRef ds:uri="http://schemas.microsoft.com/sharepoint/v3/contenttype/forms"/>
+    <ds:schemaRef ds:uri="http://schemas.openxmlformats.org/officeDocument/2006/bibliography"/>
   </ds:schemaRefs>
 </ds:datastoreItem>
 </file>
 
-<file path=customXml/itemProps3.xml><?xml version="1.0" encoding="utf-8"?>
+<file path=customXml/itemProps4.xml><?xml version="1.0" encoding="utf-8"?>
 <ds:datastoreItem xmlns:ds="http://schemas.openxmlformats.org/officeDocument/2006/customXml" ds:itemID="{131969F9-69E6-4531-89F9-CCA743737436}">
   <ds:schemaRefs>
     <ds:schemaRef ds:uri="http://schemas.microsoft.com/office/2006/metadata/contentType"/>
@@ -13788,14 +13785,6 @@
 </ds:datastoreItem>
 </file>
 
-<file path=customXml/itemProps4.xml><?xml version="1.0" encoding="utf-8"?>
-<ds:datastoreItem xmlns:ds="http://schemas.openxmlformats.org/officeDocument/2006/customXml" ds:itemID="{EF278816-EC6F-A645-907D-7F25AECB1D4A}">
-  <ds:schemaRefs>
-    <ds:schemaRef ds:uri="http://schemas.openxmlformats.org/officeDocument/2006/bibliography"/>
-  </ds:schemaRefs>
-</ds:datastoreItem>
-</file>
-
 <file path=docMetadata/LabelInfo.xml><?xml version="1.0" encoding="utf-8"?>
 <clbl:labelList xmlns:clbl="http://schemas.microsoft.com/office/2020/mipLabelMetadata">
   <clbl:label id="{7ab80a06-f029-45c0-84d1-7dad19ce3c61}" enabled="0" method="" siteId="{7ab80a06-f029-45c0-84d1-7dad19ce3c61}" removed="1"/>

</xml_diff>